<commit_message>
docs: tambahkan 8 referensi jurnal IEEE ke daftar pustaka laporan UAS
</commit_message>
<xml_diff>
--- a/docs/Laporan_UAS_Blockchain.docx
+++ b/docs/Laporan_UAS_Blockchain.docx
@@ -8,27 +8,7 @@
         <w:jc w:val="center"/>
       </w:pPr>
       <w:r>
-        <w:rPr>
-          <w:b/>
-          <w:sz w:val="24"/>
-        </w:rPr>
-        <w:t>UNIVERSITAS SILIWANGI</w:t>
-      </w:r>
-      <w:r>
-        <w:rPr>
-          <w:b/>
-          <w:sz w:val="24"/>
-        </w:rPr>
-        <w:br/>
-        <w:t>FAKULTAS TEKNIK</w:t>
-      </w:r>
-      <w:r>
-        <w:rPr>
-          <w:b/>
-          <w:sz w:val="24"/>
-        </w:rPr>
-        <w:br/>
-        <w:t>PROGRAM STUDI INFORMATIKA</w:t>
+        <w:t>UNIVERSITAS SILIWANGI FAKULTAS TEKNIK PROGRAM STUDI INFORMATIKA</w:t>
       </w:r>
     </w:p>
     <w:p>
@@ -6130,40 +6110,7 @@
         <w:jc w:val="both"/>
       </w:pPr>
       <w:r>
-        <w:t>[</w:t>
-      </w:r>
-      <w:r>
-        <w:t>7</w:t>
-      </w:r>
-      <w:r>
-        <w:t>]</w:t>
-      </w:r>
-      <w:r>
-        <w:t xml:space="preserve"> </w:t>
-      </w:r>
-      <w:r>
-        <w:t xml:space="preserve">M. M. Merlec, Md. M. Islam, Y. K. Lee, and H. P. In, “A Consortium Blockchain-Based Secure and Trusted Electronic Portfolio Management Scheme,” </w:t>
-      </w:r>
-      <w:r>
-        <w:rPr>
-          <w:i/>
-          <w:iCs/>
-        </w:rPr>
-        <w:t>Sensors</w:t>
-      </w:r>
-      <w:r>
-        <w:t xml:space="preserve">, vol. 22, no. 3, pp. 1271–1271, Feb. 2022, </w:t>
-      </w:r>
-      <w:hyperlink r:id="rId6" w:tgtFrame="_blank" w:history="1">
-        <w:r>
-          <w:rPr>
-            <w:rStyle w:val="Hyperlink"/>
-          </w:rPr>
-          <w:t>doi: 10.3390/s22031271</w:t>
-        </w:r>
-      </w:hyperlink>
-      <w:r>
-        <w:t>.</w:t>
+        <w:t>[7] M. M. Merlec, Md. M. Islam, Y. K. Lee, and H. P. In, "A Consortium Blockchain-Based Secure and Trusted Electronic Portfolio Management Scheme," Sensors, vol. 22, no. 3, pp. 1271-1271, Feb. 2022, doi: 10.3390/s22031271.</w:t>
       </w:r>
     </w:p>
     <w:p>
@@ -6171,30 +6118,7 @@
         <w:jc w:val="both"/>
       </w:pPr>
       <w:r>
-        <w:t>[</w:t>
-      </w:r>
-      <w:r>
-        <w:t>8</w:t>
-      </w:r>
-      <w:r>
-        <w:t>]</w:t>
-      </w:r>
-      <w:r>
-        <w:t xml:space="preserve"> </w:t>
-      </w:r>
-      <w:r>
-        <w:t xml:space="preserve">P. P. Bokariya and D. Motwani, “Decentralization of Credential Verification System using Blockchain,” vol. 10, no. 11, pp. 113–117, Sept. 2021, </w:t>
-      </w:r>
-      <w:hyperlink r:id="rId7" w:tgtFrame="_blank" w:history="1">
-        <w:r>
-          <w:rPr>
-            <w:rStyle w:val="Hyperlink"/>
-          </w:rPr>
-          <w:t>doi: 10.35940/IJITEE.K9514.09101121</w:t>
-        </w:r>
-      </w:hyperlink>
-      <w:r>
-        <w:t>.</w:t>
+        <w:t>[8] P. P. Bokariya and D. Motwani, "Decentralization of Credential Verification System using Blockchain," vol. 10, no. 11, pp. 113-117, Sept. 2021, doi: 10.35940/IJITEE.K9514.09101121.</w:t>
       </w:r>
     </w:p>
     <w:p>
@@ -6202,40 +6126,7 @@
         <w:jc w:val="both"/>
       </w:pPr>
       <w:r>
-        <w:t>[</w:t>
-      </w:r>
-      <w:r>
-        <w:t>9</w:t>
-      </w:r>
-      <w:r>
-        <w:t>]</w:t>
-      </w:r>
-      <w:r>
-        <w:t xml:space="preserve"> </w:t>
-      </w:r>
-      <w:r>
-        <w:t xml:space="preserve">A. Rustemi, F. Dalipi, V. Atanasovski, and A. Risteski, “DIAR: a blockchain-based system for generation and verification of academic diplomas,” </w:t>
-      </w:r>
-      <w:r>
-        <w:rPr>
-          <w:i/>
-          <w:iCs/>
-        </w:rPr>
-        <w:t>Deleted Journal</w:t>
-      </w:r>
-      <w:r>
-        <w:t xml:space="preserve">, vol. 6, no. 6, May 2024, </w:t>
-      </w:r>
-      <w:hyperlink r:id="rId8" w:tgtFrame="_blank" w:history="1">
-        <w:r>
-          <w:rPr>
-            <w:rStyle w:val="Hyperlink"/>
-          </w:rPr>
-          <w:t>doi: 10.1007/s42452-024-05984-1</w:t>
-        </w:r>
-      </w:hyperlink>
-      <w:r>
-        <w:t>.</w:t>
+        <w:t>[9] A. Rustemi, F. Dalipi, V. Atanasovski, and A. Risteski, "DIAR: a blockchain-based system for generation and verification of academic diplomas," Deleted Journal, vol. 6, no. 6, May 2024, doi: 10.1007/s42452-024-05984-1.</w:t>
       </w:r>
     </w:p>
     <w:p>
@@ -6243,40 +6134,7 @@
         <w:jc w:val="both"/>
       </w:pPr>
       <w:r>
-        <w:t>[</w:t>
-      </w:r>
-      <w:r>
-        <w:t>10</w:t>
-      </w:r>
-      <w:r>
-        <w:t>]</w:t>
-      </w:r>
-      <w:r>
-        <w:t xml:space="preserve"> </w:t>
-      </w:r>
-      <w:r>
-        <w:t xml:space="preserve">S. Alhabeeb, N. Alrusayni, R. Almutiri, S. Alhumud, and M. A. Al-Hagery, “Blockchain and machine learning in education: a literature review,” </w:t>
-      </w:r>
-      <w:r>
-        <w:rPr>
-          <w:i/>
-          <w:iCs/>
-        </w:rPr>
-        <w:t>IAES International Journal of Artificial Intelligence</w:t>
-      </w:r>
-      <w:r>
-        <w:t xml:space="preserve">, vol. 13, no. 1, pp. 581–581, Mar. 2024, </w:t>
-      </w:r>
-      <w:hyperlink r:id="rId9" w:tgtFrame="_blank" w:history="1">
-        <w:r>
-          <w:rPr>
-            <w:rStyle w:val="Hyperlink"/>
-          </w:rPr>
-          <w:t>doi: 10.11591/ijai.v13.i1.pp581-596</w:t>
-        </w:r>
-      </w:hyperlink>
-      <w:r>
-        <w:t>.</w:t>
+        <w:t>[10] S. Alhabeeb, N. Alrusayni, R. Almutiri, S. Alhumud, and M. A. Al-Hagery, "Blockchain and machine learning in education: a literature review," IAES International Journal of Artificial Intelligence, vol. 13, no. 1, pp. 581-581, Mar. 2024, doi: 10.11591/ijai.v13.i1.pp581-596.</w:t>
       </w:r>
     </w:p>
     <w:p>
@@ -6284,38 +6142,7 @@
         <w:jc w:val="both"/>
       </w:pPr>
       <w:r>
-        <w:t>[</w:t>
-      </w:r>
-      <w:r>
-        <w:t>11</w:t>
-      </w:r>
-      <w:r>
-        <w:t>]</w:t>
-      </w:r>
-      <w:r>
-        <w:t xml:space="preserve"> </w:t>
-      </w:r>
-      <w:r>
-        <w:t xml:space="preserve">“Design, Implementation, and Evaluation of Blockchain-Based </w:t>
-      </w:r>
-      <w:proofErr w:type="gramStart"/>
-      <w:r>
-        <w:t>Trusted  Achievement</w:t>
-      </w:r>
-      <w:proofErr w:type="gramEnd"/>
-      <w:r>
-        <w:t xml:space="preserve"> Record System for Students in Higher Education,” Apr. 2022, </w:t>
-      </w:r>
-      <w:hyperlink r:id="rId10" w:tgtFrame="_blank" w:history="1">
-        <w:r>
-          <w:rPr>
-            <w:rStyle w:val="Hyperlink"/>
-          </w:rPr>
-          <w:t>doi: 10.48550/arxiv.2204.12547</w:t>
-        </w:r>
-      </w:hyperlink>
-      <w:r>
-        <w:t>.</w:t>
+        <w:t>[11] "Design, Implementation, and Evaluation of Blockchain-Based Trusted Achievement Record System for Students in Higher Education," Apr. 2022, doi: 10.48550/arxiv.2204.12547.</w:t>
       </w:r>
     </w:p>
     <w:p>
@@ -6323,30 +6150,7 @@
         <w:jc w:val="both"/>
       </w:pPr>
       <w:r>
-        <w:t>[</w:t>
-      </w:r>
-      <w:r>
-        <w:t>12</w:t>
-      </w:r>
-      <w:r>
-        <w:t>]</w:t>
-      </w:r>
-      <w:r>
-        <w:t xml:space="preserve"> </w:t>
-      </w:r>
-      <w:r>
-        <w:t xml:space="preserve">E. Leka and B. Selimi, “Development and Evaluation of Blockchain based Secure Application for Verification and Validation of Academic Certificates,” vol. 5, no. 2, pp. 22–36, Apr. 2021, </w:t>
-      </w:r>
-      <w:hyperlink r:id="rId11" w:tgtFrame="_blank" w:history="1">
-        <w:r>
-          <w:rPr>
-            <w:rStyle w:val="Hyperlink"/>
-          </w:rPr>
-          <w:t>doi: 10.33166/AETIC.2021.02.003</w:t>
-        </w:r>
-      </w:hyperlink>
-      <w:r>
-        <w:t>.</w:t>
+        <w:t>[12] E. Leka and B. Selimi, "Development and Evaluation of Blockchain based Secure Application for Verification and Validation of Academic Certificates," vol. 5, no. 2, pp. 22-36, Apr. 2021, doi: 10.33166/AETIC.2021.02.003.</w:t>
       </w:r>
     </w:p>
     <w:p>
@@ -6354,44 +6158,7 @@
         <w:jc w:val="both"/>
       </w:pPr>
       <w:r>
-        <w:t>[</w:t>
-      </w:r>
-      <w:r>
-        <w:t>13</w:t>
-      </w:r>
-      <w:r>
-        <w:t>]</w:t>
-      </w:r>
-      <w:r>
-        <w:t xml:space="preserve"> </w:t>
-      </w:r>
-      <w:r>
-        <w:t xml:space="preserve">G. Maulani, Gunawan, Leli, E. A. Nabila, and W. Y. Sari, “Digital Certificate Authority with Blockchain Cybersecurity in Education”, </w:t>
-      </w:r>
-      <w:hyperlink r:id="rId12" w:tgtFrame="_blank" w:history="1">
-        <w:r>
-          <w:rPr>
-            <w:rStyle w:val="Hyperlink"/>
-          </w:rPr>
-          <w:t>doi: 10.34306/</w:t>
-        </w:r>
-        <w:proofErr w:type="gramStart"/>
-        <w:r>
-          <w:rPr>
-            <w:rStyle w:val="Hyperlink"/>
-          </w:rPr>
-          <w:t>ijcitsm.v</w:t>
-        </w:r>
-        <w:proofErr w:type="gramEnd"/>
-        <w:r>
-          <w:rPr>
-            <w:rStyle w:val="Hyperlink"/>
-          </w:rPr>
-          <w:t>1i1.40</w:t>
-        </w:r>
-      </w:hyperlink>
-      <w:r>
-        <w:t>.</w:t>
+        <w:t>[13] G. Maulani, Gunawan, Leli, E. A. Nabila, and W. Y. Sari, "Digital Certificate Authority with Blockchain Cybersecurity in Education", doi: 10.34306/ijcitsm.v1i1.40.</w:t>
       </w:r>
     </w:p>
     <w:p>
@@ -6399,30 +6166,7 @@
         <w:jc w:val="both"/>
       </w:pPr>
       <w:r>
-        <w:t>[1</w:t>
-      </w:r>
-      <w:r>
-        <w:t>4</w:t>
-      </w:r>
-      <w:r>
-        <w:t>]</w:t>
-      </w:r>
-      <w:r>
-        <w:t xml:space="preserve"> </w:t>
-      </w:r>
-      <w:r>
-        <w:t xml:space="preserve">M. Fartitchou, I. Lamaakal, K. E. Makkaoui, Z. E. Allali, and Y. Maleh, “BlockMEDC: Blockchain Smart Contracts for Securing Moroccan Higher  Education Digital Certificates,” Oct. 2024, </w:t>
-      </w:r>
-      <w:hyperlink r:id="rId13" w:tgtFrame="_blank" w:history="1">
-        <w:r>
-          <w:rPr>
-            <w:rStyle w:val="Hyperlink"/>
-          </w:rPr>
-          <w:t>doi: 10.48550/arxiv.2410.07258</w:t>
-        </w:r>
-      </w:hyperlink>
-      <w:r>
-        <w:t>.</w:t>
+        <w:t>[14] M. Fartitchou, I. Lamaakal, K. E. Makkaoui, Z. E. Allali, and Y. Maleh, "BlockMEDC: Blockchain Smart Contracts for Securing Moroccan Higher Education Digital Certificates," Oct. 2024, doi: 10.48550/arxiv.2410.07258.</w:t>
       </w:r>
     </w:p>
     <w:p>

</xml_diff>